<commit_message>
Corresponding author propagated to HTML + all Word builds; CLAUDE.md source-of-truth policy
Co-Authored-By: Claude Fable 5 <noreply@anthropic.com>
</commit_message>
<xml_diff>
--- a/docs/JoulePoint_1col.docx
+++ b/docs/JoulePoint_1col.docx
@@ -16,150 +16,140 @@
         <w:t xml:space="preserve">The Joule Point: an Energy-Optimal Operating Point for AI Inference</w:t>
       </w:r>
     </w:p>
-    <w:tbl>
-      <w:tblPr>
-        <w:tblW w:type="pct" w:w="5000"/>
-        <w:tblLook w:firstColumn="1" w:firstRow="1" w:lastColumn="0" w:lastRow="0" w:noHBand="0" w:noVBand="1" w:val="04A0"/>
+    <w:p>
+      <w:pPr>
+        <w:pStyle w:val="Subtitle"/>
+        <w:spacing w:before="0" w:after="160"/>
         <w:jc w:val="center"/>
-        <w:tblBorders>
-          <w:top w:val="nil"/>
-          <w:left w:val="nil"/>
-          <w:bottom w:val="nil"/>
-          <w:right w:val="nil"/>
-          <w:insideH w:val="nil"/>
-          <w:insideV w:val="nil"/>
-        </w:tblBorders>
-        <w:tblLayout w:type="autofit"/>
-      </w:tblPr>
-      <w:tblGrid>
-        <w:gridCol w:w="9360"/>
-      </w:tblGrid>
-      <w:tr>
-        <w:tc>
-          <w:tcPr>
-            <w:tcW w:type="dxa" w:w="9360"/>
-            <w:tcBorders>
-              <w:left w:val="nil"/>
-              <w:right w:val="nil"/>
-              <w:top w:val="nil"/>
-              <w:bottom w:val="nil"/>
-            </w:tcBorders>
-          </w:tcPr>
-          <w:p>
-            <w:pPr>
-              <w:spacing w:before="0" w:after="40" w:line="240" w:lineRule="auto"/>
-              <w:jc w:val="center"/>
-            </w:pPr>
-            <w:r/>
-            <w:r>
-              <w:rPr>
-                <w:rFonts w:ascii="Georgia" w:hAnsi="Georgia"/>
-                <w:b/>
-                <w:i w:val="0"/>
-                <w:sz w:val="24"/>
-              </w:rPr>
-              <w:t>Alexander Apartsin</w:t>
-            </w:r>
-            <w:r>
-              <w:rPr>
-                <w:rFonts w:ascii="Georgia" w:hAnsi="Georgia"/>
-                <w:b/>
-                <w:i w:val="0"/>
-                <w:sz w:val="24"/>
-                <w:vertAlign w:val="superscript"/>
-              </w:rPr>
-              <w:t>1</w:t>
-            </w:r>
-            <w:r>
-              <w:rPr>
-                <w:rFonts w:ascii="Georgia" w:hAnsi="Georgia"/>
-                <w:b/>
-                <w:i w:val="0"/>
-                <w:sz w:val="24"/>
-              </w:rPr>
-              <w:t xml:space="preserve"> </w:t>
-            </w:r>
-            <w:r>
-              <w:rPr>
-                <w:rFonts w:ascii="Georgia" w:hAnsi="Georgia"/>
-                <w:b/>
-                <w:i w:val="0"/>
-                <w:sz w:val="24"/>
-              </w:rPr>
-              <w:t xml:space="preserve"> ·  Yehudit Aperstein</w:t>
-            </w:r>
-            <w:r>
-              <w:rPr>
-                <w:rFonts w:ascii="Georgia" w:hAnsi="Georgia"/>
-                <w:b/>
-                <w:i w:val="0"/>
-                <w:sz w:val="24"/>
-                <w:vertAlign w:val="superscript"/>
-              </w:rPr>
-              <w:t>2</w:t>
-            </w:r>
-          </w:p>
-        </w:tc>
-      </w:tr>
-      <w:tr>
-        <w:tc>
-          <w:tcPr>
-            <w:tcW w:type="dxa" w:w="9360"/>
-            <w:tcBorders>
-              <w:left w:val="nil"/>
-              <w:right w:val="nil"/>
-              <w:top w:val="nil"/>
-              <w:bottom w:val="nil"/>
-            </w:tcBorders>
-          </w:tcPr>
-          <w:p>
-            <w:pPr>
-              <w:spacing w:before="0" w:after="120" w:line="240" w:lineRule="auto"/>
-              <w:jc w:val="center"/>
-            </w:pPr>
-            <w:r/>
-            <w:r>
-              <w:rPr>
-                <w:rFonts w:ascii="Georgia" w:hAnsi="Georgia"/>
-                <w:b w:val="0"/>
-                <w:i/>
-                <w:sz w:val="20"/>
-                <w:vertAlign w:val="superscript"/>
-              </w:rPr>
-              <w:t>1</w:t>
-            </w:r>
-            <w:r>
-              <w:rPr>
-                <w:rFonts w:ascii="Georgia" w:hAnsi="Georgia"/>
-                <w:b w:val="0"/>
-                <w:i/>
-                <w:sz w:val="20"/>
-              </w:rPr>
-              <w:t xml:space="preserve">Holon Institute of Technology, Holon, Israel   </w:t>
-            </w:r>
-            <w:r>
-              <w:rPr>
-                <w:rFonts w:ascii="Georgia" w:hAnsi="Georgia"/>
-                <w:b w:val="0"/>
-                <w:i/>
-                <w:sz w:val="20"/>
-                <w:vertAlign w:val="superscript"/>
-              </w:rPr>
-              <w:t>2</w:t>
-            </w:r>
-            <w:r>
-              <w:rPr>
-                <w:rFonts w:ascii="Georgia" w:hAnsi="Georgia"/>
-                <w:b w:val="0"/>
-                <w:i/>
-                <w:sz w:val="20"/>
-              </w:rPr>
-              <w:t>Afeka Academic College of Engineering, Tel Aviv, Israel</w:t>
-            </w:r>
-          </w:p>
-        </w:tc>
-      </w:tr>
-    </w:tbl>
+        <w:keepNext w:val="0"/>
+        <w:keepLines/>
+        <w:widowControl w:val="1"/>
+      </w:pPr>
+      <w:r>
+        <w:rPr>
+          <w:rFonts w:ascii="Georgia" w:hAnsi="Georgia"/>
+          <w:b w:val="0"/>
+          <w:i/>
+          <w:sz w:val="20"/>
+        </w:rPr>
+        <w:t xml:space="preserve">Alexander Apartsin</w:t>
+      </w:r>
+      <w:r>
+        <w:rPr>
+          <w:rFonts w:ascii="Georgia" w:hAnsi="Georgia"/>
+          <w:b w:val="0"/>
+          <w:i/>
+          <w:sz w:val="20"/>
+          <w:vertAlign w:val="superscript"/>
+        </w:rPr>
+        <w:t xml:space="preserve">1</w:t>
+      </w:r>
+      <w:r>
+        <w:rPr>
+          <w:rFonts w:ascii="Georgia" w:hAnsi="Georgia"/>
+          <w:b w:val="0"/>
+          <w:i/>
+          <w:sz w:val="20"/>
+        </w:rPr>
+        <w:t xml:space="preserve"> </w:t>
+      </w:r>
+      <w:r>
+        <w:rPr>
+          <w:rFonts w:ascii="Georgia" w:hAnsi="Georgia"/>
+          <w:b w:val="0"/>
+          <w:i/>
+          <w:sz w:val="20"/>
+        </w:rPr>
+        <w:t xml:space="preserve"> ·  Yehudit Aperstein</w:t>
+      </w:r>
+      <w:r>
+        <w:rPr>
+          <w:rFonts w:ascii="Georgia" w:hAnsi="Georgia"/>
+          <w:b w:val="0"/>
+          <w:i/>
+          <w:sz w:val="20"/>
+          <w:vertAlign w:val="superscript"/>
+        </w:rPr>
+        <w:t xml:space="preserve">2,*</w:t>
+      </w:r>
+    </w:p>
+    <w:p>
+      <w:pPr>
+        <w:pStyle w:val="Subtitle"/>
+        <w:spacing w:before="0" w:after="160"/>
+        <w:jc w:val="center"/>
+        <w:keepNext w:val="0"/>
+        <w:keepLines/>
+        <w:widowControl w:val="1"/>
+      </w:pPr>
+      <w:r>
+        <w:rPr>
+          <w:rFonts w:ascii="Georgia" w:hAnsi="Georgia"/>
+          <w:b w:val="0"/>
+          <w:i/>
+          <w:sz w:val="20"/>
+          <w:vertAlign w:val="superscript"/>
+        </w:rPr>
+        <w:t xml:space="preserve">1</w:t>
+      </w:r>
+      <w:r>
+        <w:rPr>
+          <w:rFonts w:ascii="Georgia" w:hAnsi="Georgia"/>
+          <w:b w:val="0"/>
+          <w:i/>
+          <w:sz w:val="20"/>
+        </w:rPr>
+        <w:t xml:space="preserve">Holon Institute of Technology, Holon, Israel   </w:t>
+      </w:r>
+      <w:r>
+        <w:rPr>
+          <w:rFonts w:ascii="Georgia" w:hAnsi="Georgia"/>
+          <w:b w:val="0"/>
+          <w:i/>
+          <w:sz w:val="20"/>
+          <w:vertAlign w:val="superscript"/>
+        </w:rPr>
+        <w:t xml:space="preserve">2</w:t>
+      </w:r>
+      <w:r>
+        <w:rPr>
+          <w:rFonts w:ascii="Georgia" w:hAnsi="Georgia"/>
+          <w:b w:val="0"/>
+          <w:i/>
+          <w:sz w:val="20"/>
+        </w:rPr>
+        <w:t xml:space="preserve">Afeka Academic College of Engineering, Tel Aviv, Israel</w:t>
+      </w:r>
+    </w:p>
+    <w:p>
+      <w:pPr>
+        <w:pStyle w:val="Subtitle"/>
+        <w:spacing w:before="0" w:after="40"/>
+        <w:jc w:val="center"/>
+        <w:keepNext/>
+        <w:keepLines/>
+        <w:widowControl w:val="1"/>
+      </w:pPr>
+      <w:r>
+        <w:rPr>
+          <w:rFonts w:ascii="Georgia" w:hAnsi="Georgia"/>
+          <w:b/>
+          <w:i w:val="0"/>
+          <w:sz w:val="24"/>
+          <w:vertAlign w:val="superscript"/>
+        </w:rPr>
+        <w:t xml:space="preserve">*</w:t>
+      </w:r>
+      <w:r>
+        <w:rPr>
+          <w:rFonts w:ascii="Georgia" w:hAnsi="Georgia"/>
+          <w:b/>
+          <w:i w:val="0"/>
+          <w:sz w:val="24"/>
+        </w:rPr>
+        <w:t xml:space="preserve">Corresponding author: apersteiny@afeka.ac.il</w:t>
+      </w:r>
+    </w:p>
     <w:p>
       <w:pPr>
         <w:pStyle w:val="AbstractLabel"/>

</xml_diff>

<commit_message>
Submission readiness: keywords, CRediT statement, competing-interest declaration in all formats; highlights file
Co-Authored-By: Claude Fable 5 <noreply@anthropic.com>
</commit_message>
<xml_diff>
--- a/docs/JoulePoint_1col.docx
+++ b/docs/JoulePoint_1col.docx
@@ -2,7 +2,7 @@
 <file path=word/document.xml><?xml version="1.0" encoding="utf-8"?>
 <w:document xmlns:w="http://schemas.openxmlformats.org/wordprocessingml/2006/main" xmlns:m="http://schemas.openxmlformats.org/officeDocument/2006/math" xmlns:r="http://schemas.openxmlformats.org/officeDocument/2006/relationships" xmlns:o="urn:schemas-microsoft-com:office:office" xmlns:v="urn:schemas-microsoft-com:vml" xmlns:w10="urn:schemas-microsoft-com:office:word" xmlns:a="http://schemas.openxmlformats.org/drawingml/2006/main" xmlns:pic="http://schemas.openxmlformats.org/drawingml/2006/picture" xmlns:wp="http://schemas.openxmlformats.org/drawingml/2006/wordprocessingDrawing">
   <w:body>
-    <w:bookmarkStart w:id="40" w:name="X7b0177053e15349d7262ee04b1c662261a5a653"/>
+    <w:bookmarkStart w:id="42" w:name="X7b0177053e15349d7262ee04b1c662261a5a653"/>
     <w:p>
       <w:pPr>
         <w:pStyle w:val="Title"/>
@@ -294,6 +294,28 @@
       </w:r>
       <w:r>
         <w:t xml:space="preserve">carbon signal while meeting its service targets.</w:t>
+      </w:r>
+    </w:p>
+    <w:p>
+      <w:pPr>
+        <w:pStyle w:val="Keywords"/>
+        <w:jc w:val="both"/>
+        <w:keepNext w:val="0"/>
+        <w:keepLines w:val="0"/>
+        <w:widowControl w:val="1"/>
+      </w:pPr>
+      <w:r>
+        <w:rPr>
+          <w:b/>
+          <w:bCs/>
+        </w:rPr>
+        <w:t xml:space="preserve">Keywords:</w:t>
+      </w:r>
+      <w:r>
+        <w:t xml:space="preserve"> </w:t>
+      </w:r>
+      <w:r>
+        <w:t xml:space="preserve">GPU energy efficiency; power capping; AI inference; DVFS; energy-aware scheduling; data centers</w:t>
       </w:r>
     </w:p>
     <w:bookmarkStart w:id="9" w:name="introduction"/>
@@ -6152,7 +6174,7 @@
       </w:r>
     </w:p>
     <w:bookmarkEnd w:id="36"/>
-    <w:bookmarkStart w:id="38" w:name="data-and-code-availability"/>
+    <w:bookmarkStart w:id="37" w:name="credit-authorship-contribution-statement"/>
     <w:p>
       <w:pPr>
         <w:pStyle w:val="Heading2"/>
@@ -6161,7 +6183,7 @@
         <w:widowControl w:val="1"/>
       </w:pPr>
       <w:r>
-        <w:t xml:space="preserve">Data and code availability</w:t>
+        <w:t xml:space="preserve">CRediT authorship contribution statement</w:t>
       </w:r>
     </w:p>
     <w:p>
@@ -6173,6 +6195,82 @@
         <w:widowControl w:val="1"/>
       </w:pPr>
       <w:r>
+        <w:rPr>
+          <w:b/>
+          <w:bCs/>
+        </w:rPr>
+        <w:t xml:space="preserve">Alexander Apartsin:</w:t>
+      </w:r>
+      <w:r>
+        <w:t xml:space="preserve"> </w:t>
+      </w:r>
+      <w:r>
+        <w:t xml:space="preserve">Conceptualization, Methodology, Software, Investigation, Data curation, Writing - original draft.</w:t>
+      </w:r>
+      <w:r>
+        <w:t xml:space="preserve"> </w:t>
+      </w:r>
+      <w:r>
+        <w:rPr>
+          <w:b/>
+          <w:bCs/>
+        </w:rPr>
+        <w:t xml:space="preserve">Yehudit Aperstein:</w:t>
+      </w:r>
+      <w:r>
+        <w:t xml:space="preserve"> </w:t>
+      </w:r>
+      <w:r>
+        <w:t xml:space="preserve">Conceptualization, Methodology, Validation, Writing - review and editing, Supervision.</w:t>
+      </w:r>
+    </w:p>
+    <w:bookmarkEnd w:id="37"/>
+    <w:bookmarkStart w:id="38" w:name="declaration-of-competing-interest"/>
+    <w:p>
+      <w:pPr>
+        <w:pStyle w:val="Heading2"/>
+        <w:keepNext/>
+        <w:keepLines/>
+        <w:widowControl w:val="1"/>
+      </w:pPr>
+      <w:r>
+        <w:t xml:space="preserve">Declaration of competing interest</w:t>
+      </w:r>
+    </w:p>
+    <w:p>
+      <w:pPr>
+        <w:pStyle w:val="FirstParagraph"/>
+        <w:jc w:val="both"/>
+        <w:keepNext w:val="0"/>
+        <w:keepLines w:val="0"/>
+        <w:widowControl w:val="1"/>
+      </w:pPr>
+      <w:r>
+        <w:t xml:space="preserve">The authors declare that they have no known competing financial interests or personal relationships that could have appeared to influence the work reported in this paper.</w:t>
+      </w:r>
+    </w:p>
+    <w:bookmarkEnd w:id="38"/>
+    <w:bookmarkStart w:id="40" w:name="data-and-code-availability"/>
+    <w:p>
+      <w:pPr>
+        <w:pStyle w:val="Heading2"/>
+        <w:keepNext/>
+        <w:keepLines/>
+        <w:widowControl w:val="1"/>
+      </w:pPr>
+      <w:r>
+        <w:t xml:space="preserve">Data and code availability</w:t>
+      </w:r>
+    </w:p>
+    <w:p>
+      <w:pPr>
+        <w:pStyle w:val="FirstParagraph"/>
+        <w:jc w:val="both"/>
+        <w:keepNext w:val="0"/>
+        <w:keepLines w:val="0"/>
+        <w:widowControl w:val="1"/>
+      </w:pPr>
+      <w:r>
         <w:t xml:space="preserve">The ELF dataset, twenty inference models swept over the board power cap on four NVIDIA GPUs, together with</w:t>
       </w:r>
       <w:r>
@@ -6184,7 +6282,7 @@
       <w:r>
         <w:t xml:space="preserve"> </w:t>
       </w:r>
-      <w:hyperlink r:id="rId37">
+      <w:hyperlink r:id="rId39">
         <w:r>
           <w:rPr>
             <w:rStyle w:val="Hyperlink"/>
@@ -6208,8 +6306,8 @@
         <w:t xml:space="preserve">build script.</w:t>
       </w:r>
     </w:p>
-    <w:bookmarkEnd w:id="38"/>
-    <w:bookmarkStart w:id="39" w:name="references"/>
+    <w:bookmarkEnd w:id="40"/>
+    <w:bookmarkStart w:id="41" w:name="references"/>
     <w:p>
       <w:pPr>
         <w:pStyle w:val="ReferencesHeading"/>
@@ -7770,8 +7868,8 @@
         <w:t xml:space="preserve">Customer Services Directorate, Airbus, Blagnac, France, 1998.</w:t>
       </w:r>
     </w:p>
-    <w:bookmarkEnd w:id="39"/>
-    <w:bookmarkEnd w:id="40"/>
+    <w:bookmarkEnd w:id="41"/>
+    <w:bookmarkEnd w:id="42"/>
     <w:sectPr>
       <w:footerReference w:type="default" r:id="rId9"/>
       <w:pgSz w:h="15840" w:w="12240"/>

</xml_diff>